<commit_message>
docs(dm): DM 手冊依 10/05 後合併的程式改動修正，重拍 dm02-07、dm03-02 (#684)
- DM02：發布／退回／廢止通知撰寫者改為 DM04 站內呈現；催辦改以 Email 寄出；「已完成」補送審者與退回原因
- DM04：草稿匣僅編輯者可見；退回原因改為獨立欄位；寄 Email 的通知補簽核催辦
- DM01：關聯作業項目補本系統 EDMS- 開頭代碼說明
- DM03：重拍唯讀頁（提示列與版本歷程說明文字已更新）
- 測試項目同步並重產 DM 測試報告

DM02 核准訊息待 #677、DM04 兩張截圖與廢止退回原因待 #679 合併後再改。

Co-authored-by: Claude Opus 5.5 <noreply@anthropic.com>
</commit_message>
<xml_diff>
--- a/docs/manuals/測試報告/DM-文件管理模組.docx
+++ b/docs/manuals/測試報告/DM-文件管理模組.docx
@@ -226,7 +226,7 @@
           </w:tcPr>
           <w:p>
             <w:r>
-              <w:t>2026/10/13</w:t>
+              <w:t>2026/10/16</w:t>
             </w:r>
           </w:p>
         </w:tc>
@@ -384,7 +384,7 @@
               <w:jc w:val="center"/>
             </w:pPr>
             <w:r>
-              <w:t>2026/10/13</w:t>
+              <w:t>2026/10/16</w:t>
             </w:r>
           </w:p>
         </w:tc>
@@ -4093,7 +4093,7 @@
                 <w:b w:val="0"/>
                 <w:sz w:val="22"/>
               </w:rPr>
-              <w:t>承上，每日催辦排程執行後（或請 IT 手動觸發），審核者甲應收到該項目之催辦通知。</w:t>
+              <w:t>承上，每日催辦排程執行後（或請 IT 手動觸發），審核者甲應收到該項目之催辦 Email，信中含文件名稱與停留天數。</w:t>
             </w:r>
           </w:p>
         </w:tc>
@@ -4813,7 +4813,7 @@
                 <w:b w:val="0"/>
                 <w:sz w:val="22"/>
               </w:rPr>
-              <w:t>對文件 Q 按「退回」，填寫退回原因後按「確認退回」，該項目應標示為已退回並移至「已完成」，文件 Q 回到編輯者甲個人專區之草稿；編輯者甲之「我的文件動態」應出現「已退回」列（站內呈現，不寄 Email），其下方顯示剛才填寫的退回原因，按展開箭頭可看到全文。</w:t>
+              <w:t>對文件 Q 按「退回」，填寫退回原因後按「確認退回」，該項目應標示為已退回並移至「已完成」，文件 Q 回到編輯者甲個人專區之草稿；編輯者甲之「我的文件動態」應出現「已退回」列（站內呈現，不寄 Email），該列「退回原因」欄顯示剛才填寫的退回原因全文。</w:t>
             </w:r>
           </w:p>
         </w:tc>
@@ -5053,7 +5053,7 @@
                 <w:b w:val="0"/>
                 <w:sz w:val="22"/>
               </w:rPr>
-              <w:t>切換至「已完成」，應列出本人核准與退回之項目及其結果；於「搜尋文件名稱」輸入文件 P 名稱之一段應篩出該筆，且項目上無核准或退回之操作。</w:t>
+              <w:t>切換至「已完成」，應列出本人核准與退回之項目、結果與送審者；文件 Q 之退回列「退回原因」欄應為所填原因，文件 P 之核准列為「—」；於「搜尋文件名稱」輸入文件 P 名稱之一段應篩出該筆，且項目上無核准或退回之操作。</w:t>
             </w:r>
           </w:p>
         </w:tc>
@@ -7118,6 +7118,86 @@
                 <w:sz w:val="22"/>
               </w:rPr>
               <w:t>以雙角色帳號進入個人專區，「我的文件動態」應同時出現「撰寫者視角（近 30 天）」與「審核者視角（近 30 天）」兩區。</w:t>
+            </w:r>
+          </w:p>
+        </w:tc>
+        <w:tc>
+          <w:tcPr>
+            <w:tcW w:type="dxa" w:w="1247"/>
+          </w:tcPr>
+          <w:p>
+            <w:pPr>
+              <w:spacing w:before="40" w:after="40"/>
+              <w:jc w:val="center"/>
+            </w:pPr>
+            <w:r/>
+            <w:r>
+              <w:rPr>
+                <w:rFonts w:ascii="標楷體" w:hAnsi="標楷體" w:eastAsia="標楷體"/>
+                <w:b w:val="0"/>
+                <w:sz w:val="24"/>
+              </w:rPr>
+            </w:r>
+          </w:p>
+        </w:tc>
+        <w:tc>
+          <w:tcPr>
+            <w:tcW w:type="dxa" w:w="1247"/>
+          </w:tcPr>
+          <w:p>
+            <w:pPr>
+              <w:spacing w:before="40" w:after="40"/>
+              <w:jc w:val="center"/>
+            </w:pPr>
+            <w:r/>
+            <w:r>
+              <w:rPr>
+                <w:rFonts w:ascii="標楷體" w:hAnsi="標楷體" w:eastAsia="標楷體"/>
+                <w:b w:val="0"/>
+                <w:sz w:val="24"/>
+              </w:rPr>
+            </w:r>
+          </w:p>
+        </w:tc>
+      </w:tr>
+      <w:tr>
+        <w:tc>
+          <w:tcPr>
+            <w:tcW w:type="dxa" w:w="907"/>
+          </w:tcPr>
+          <w:p>
+            <w:pPr>
+              <w:spacing w:before="40" w:after="40"/>
+              <w:jc w:val="center"/>
+            </w:pPr>
+            <w:r/>
+            <w:r>
+              <w:rPr>
+                <w:rFonts w:ascii="標楷體" w:hAnsi="標楷體" w:eastAsia="標楷體"/>
+                <w:b w:val="0"/>
+                <w:sz w:val="22"/>
+              </w:rPr>
+              <w:t>1-1</w:t>
+            </w:r>
+          </w:p>
+        </w:tc>
+        <w:tc>
+          <w:tcPr>
+            <w:tcW w:type="dxa" w:w="6236"/>
+          </w:tcPr>
+          <w:p>
+            <w:pPr>
+              <w:spacing w:before="40" w:after="40"/>
+              <w:jc w:val="left"/>
+            </w:pPr>
+            <w:r/>
+            <w:r>
+              <w:rPr>
+                <w:rFonts w:ascii="標楷體" w:hAnsi="標楷體" w:eastAsia="標楷體"/>
+                <w:b w:val="0"/>
+                <w:sz w:val="22"/>
+              </w:rPr>
+              <w:t>以審核者甲進入個人專區，應只有「我的文件動態」一個分頁，不出現「草稿匣」。</w:t>
             </w:r>
           </w:p>
         </w:tc>

</xml_diff>